<commit_message>
Implement full 13-experiment FSJ lab suite: GenericRailStatusServlet, JS email validation, DOM color rotation, React Hooks 4 color buttons, React SPA, Spring Boot Monolith, RESTful APIs, and interactive Lab Suite (experiments.jsp)
</commit_message>
<xml_diff>
--- a/RailRush_Project_Report.docx
+++ b/RailRush_Project_Report.docx
@@ -870,13 +870,13 @@
       <w:tr>
         <w:tc>
           <w:tcPr>
-            <w:tcW w:type="dxa" w:w="1440"/>
+            <w:tcW w:type="dxa" w:w="1296"/>
             <w:shd w:fill="F4F6F9"/>
             <w:tcMar>
-              <w:top w:w="80" w:type="dxa"/>
-              <w:bottom w:w="80" w:type="dxa"/>
-              <w:left w:w="90" w:type="dxa"/>
-              <w:right w:w="90" w:type="dxa"/>
+              <w:top w:w="70" w:type="dxa"/>
+              <w:bottom w:w="70" w:type="dxa"/>
+              <w:left w:w="80" w:type="dxa"/>
+              <w:right w:w="80" w:type="dxa"/>
             </w:tcMar>
           </w:tcPr>
           <w:p>
@@ -887,7 +887,7 @@
               <w:rPr>
                 <w:b/>
                 <w:color w:val="1E3C72"/>
-                <w:sz w:val="19"/>
+                <w:sz w:val="18"/>
               </w:rPr>
               <w:t>Exp 01</w:t>
             </w:r>
@@ -895,13 +895,13 @@
         </w:tc>
         <w:tc>
           <w:tcPr>
-            <w:tcW w:type="dxa" w:w="3168"/>
+            <w:tcW w:type="dxa" w:w="3312"/>
             <w:shd w:fill="F4F6F9"/>
             <w:tcMar>
-              <w:top w:w="80" w:type="dxa"/>
-              <w:bottom w:w="80" w:type="dxa"/>
-              <w:left w:w="90" w:type="dxa"/>
-              <w:right w:w="90" w:type="dxa"/>
+              <w:top w:w="70" w:type="dxa"/>
+              <w:bottom w:w="70" w:type="dxa"/>
+              <w:left w:w="80" w:type="dxa"/>
+              <w:right w:w="80" w:type="dxa"/>
             </w:tcMar>
           </w:tcPr>
           <w:p>
@@ -910,9 +910,9 @@
             </w:pPr>
             <w:r>
               <w:rPr>
-                <w:sz w:val="19"/>
+                <w:sz w:val="18"/>
               </w:rPr>
-              <w:t>Classes, Encapsulation &amp; Objects</w:t>
+              <w:t>Programs on classes and objects</w:t>
             </w:r>
           </w:p>
         </w:tc>
@@ -921,10 +921,10 @@
             <w:tcW w:type="dxa" w:w="4752"/>
             <w:shd w:fill="F4F6F9"/>
             <w:tcMar>
-              <w:top w:w="80" w:type="dxa"/>
-              <w:bottom w:w="80" w:type="dxa"/>
-              <w:left w:w="90" w:type="dxa"/>
-              <w:right w:w="90" w:type="dxa"/>
+              <w:top w:w="70" w:type="dxa"/>
+              <w:bottom w:w="70" w:type="dxa"/>
+              <w:left w:w="80" w:type="dxa"/>
+              <w:right w:w="80" w:type="dxa"/>
             </w:tcMar>
           </w:tcPr>
           <w:p>
@@ -933,9 +933,9 @@
             </w:pPr>
             <w:r>
               <w:rPr>
-                <w:sz w:val="19"/>
+                <w:sz w:val="18"/>
               </w:rPr>
-              <w:t>Domain model encapsulation with private members, standard getters/setters in User, Train, Ticket, and Passenger.</w:t>
+              <w:t>Encapsulated domain entities with private members, standard getters/setters in Train.java, User.java, Ticket.java, and Passenger.java.</w:t>
             </w:r>
           </w:p>
         </w:tc>
@@ -943,12 +943,12 @@
       <w:tr>
         <w:tc>
           <w:tcPr>
-            <w:tcW w:type="dxa" w:w="1440"/>
+            <w:tcW w:type="dxa" w:w="1296"/>
             <w:tcMar>
-              <w:top w:w="80" w:type="dxa"/>
-              <w:bottom w:w="80" w:type="dxa"/>
-              <w:left w:w="90" w:type="dxa"/>
-              <w:right w:w="90" w:type="dxa"/>
+              <w:top w:w="70" w:type="dxa"/>
+              <w:bottom w:w="70" w:type="dxa"/>
+              <w:left w:w="80" w:type="dxa"/>
+              <w:right w:w="80" w:type="dxa"/>
             </w:tcMar>
           </w:tcPr>
           <w:p>
@@ -959,7 +959,7 @@
               <w:rPr>
                 <w:b/>
                 <w:color w:val="1E3C72"/>
-                <w:sz w:val="19"/>
+                <w:sz w:val="18"/>
               </w:rPr>
               <w:t>Exp 02</w:t>
             </w:r>
@@ -967,12 +967,12 @@
         </w:tc>
         <w:tc>
           <w:tcPr>
-            <w:tcW w:type="dxa" w:w="3168"/>
+            <w:tcW w:type="dxa" w:w="3312"/>
             <w:tcMar>
-              <w:top w:w="80" w:type="dxa"/>
-              <w:bottom w:w="80" w:type="dxa"/>
-              <w:left w:w="90" w:type="dxa"/>
-              <w:right w:w="90" w:type="dxa"/>
+              <w:top w:w="70" w:type="dxa"/>
+              <w:bottom w:w="70" w:type="dxa"/>
+              <w:left w:w="80" w:type="dxa"/>
+              <w:right w:w="80" w:type="dxa"/>
             </w:tcMar>
           </w:tcPr>
           <w:p>
@@ -981,9 +981,9 @@
             </w:pPr>
             <w:r>
               <w:rPr>
-                <w:sz w:val="19"/>
+                <w:sz w:val="18"/>
               </w:rPr>
-              <w:t>Constructor &amp; Method Overloading</w:t>
+              <w:t>Programs on method and constructor overloading</w:t>
             </w:r>
           </w:p>
         </w:tc>
@@ -991,10 +991,10 @@
           <w:tcPr>
             <w:tcW w:type="dxa" w:w="4752"/>
             <w:tcMar>
-              <w:top w:w="80" w:type="dxa"/>
-              <w:bottom w:w="80" w:type="dxa"/>
-              <w:left w:w="90" w:type="dxa"/>
-              <w:right w:w="90" w:type="dxa"/>
+              <w:top w:w="70" w:type="dxa"/>
+              <w:bottom w:w="70" w:type="dxa"/>
+              <w:left w:w="80" w:type="dxa"/>
+              <w:right w:w="80" w:type="dxa"/>
             </w:tcMar>
           </w:tcPr>
           <w:p>
@@ -1003,9 +1003,9 @@
             </w:pPr>
             <w:r>
               <w:rPr>
-                <w:sz w:val="19"/>
+                <w:sz w:val="18"/>
               </w:rPr>
-              <w:t>Overloaded constructors in Train.java (minimal lookup vs full tariff route); overloaded searchTrain() signatures.</w:t>
+              <w:t>Overloaded constructors in Train.java (minimal lookup vs full tariff route); overloaded searchTrain() queries in TrainDAO.java.</w:t>
             </w:r>
           </w:p>
         </w:tc>
@@ -1013,13 +1013,13 @@
       <w:tr>
         <w:tc>
           <w:tcPr>
-            <w:tcW w:type="dxa" w:w="1440"/>
+            <w:tcW w:type="dxa" w:w="1296"/>
             <w:shd w:fill="F4F6F9"/>
             <w:tcMar>
-              <w:top w:w="80" w:type="dxa"/>
-              <w:bottom w:w="80" w:type="dxa"/>
-              <w:left w:w="90" w:type="dxa"/>
-              <w:right w:w="90" w:type="dxa"/>
+              <w:top w:w="70" w:type="dxa"/>
+              <w:bottom w:w="70" w:type="dxa"/>
+              <w:left w:w="80" w:type="dxa"/>
+              <w:right w:w="80" w:type="dxa"/>
             </w:tcMar>
           </w:tcPr>
           <w:p>
@@ -1030,7 +1030,7 @@
               <w:rPr>
                 <w:b/>
                 <w:color w:val="1E3C72"/>
-                <w:sz w:val="19"/>
+                <w:sz w:val="18"/>
               </w:rPr>
               <w:t>Exp 03</w:t>
             </w:r>
@@ -1038,13 +1038,13 @@
         </w:tc>
         <w:tc>
           <w:tcPr>
-            <w:tcW w:type="dxa" w:w="3168"/>
+            <w:tcW w:type="dxa" w:w="3312"/>
             <w:shd w:fill="F4F6F9"/>
             <w:tcMar>
-              <w:top w:w="80" w:type="dxa"/>
-              <w:bottom w:w="80" w:type="dxa"/>
-              <w:left w:w="90" w:type="dxa"/>
-              <w:right w:w="90" w:type="dxa"/>
+              <w:top w:w="70" w:type="dxa"/>
+              <w:bottom w:w="70" w:type="dxa"/>
+              <w:left w:w="80" w:type="dxa"/>
+              <w:right w:w="80" w:type="dxa"/>
             </w:tcMar>
           </w:tcPr>
           <w:p>
@@ -1053,9 +1053,9 @@
             </w:pPr>
             <w:r>
               <w:rPr>
-                <w:sz w:val="19"/>
+                <w:sz w:val="18"/>
               </w:rPr>
-              <w:t>Inheritance &amp; Custom Exceptions</w:t>
+              <w:t>Programs on various types of inheritance and Exception handling</w:t>
             </w:r>
           </w:p>
         </w:tc>
@@ -1064,10 +1064,10 @@
             <w:tcW w:type="dxa" w:w="4752"/>
             <w:shd w:fill="F4F6F9"/>
             <w:tcMar>
-              <w:top w:w="80" w:type="dxa"/>
-              <w:bottom w:w="80" w:type="dxa"/>
-              <w:left w:w="90" w:type="dxa"/>
-              <w:right w:w="90" w:type="dxa"/>
+              <w:top w:w="70" w:type="dxa"/>
+              <w:bottom w:w="70" w:type="dxa"/>
+              <w:left w:w="80" w:type="dxa"/>
+              <w:right w:w="80" w:type="dxa"/>
             </w:tcMar>
           </w:tcPr>
           <w:p>
@@ -1076,9 +1076,9 @@
             </w:pPr>
             <w:r>
               <w:rPr>
-                <w:sz w:val="19"/>
+                <w:sz w:val="18"/>
               </w:rPr>
-              <w:t>Hierarchical inheritance (PassengerUser extends User); Custom exceptions: SeatUnavailableException, InvalidPNRException, BookingFailedException.</w:t>
+              <w:t>Hierarchical inheritance (PassengerUser and AdminUser extending User); Custom exceptions: SeatUnavailableException, InvalidPNRException, BookingFailedException.</w:t>
             </w:r>
           </w:p>
         </w:tc>
@@ -1086,12 +1086,12 @@
       <w:tr>
         <w:tc>
           <w:tcPr>
-            <w:tcW w:type="dxa" w:w="1440"/>
+            <w:tcW w:type="dxa" w:w="1296"/>
             <w:tcMar>
-              <w:top w:w="80" w:type="dxa"/>
-              <w:bottom w:w="80" w:type="dxa"/>
-              <w:left w:w="90" w:type="dxa"/>
-              <w:right w:w="90" w:type="dxa"/>
+              <w:top w:w="70" w:type="dxa"/>
+              <w:bottom w:w="70" w:type="dxa"/>
+              <w:left w:w="80" w:type="dxa"/>
+              <w:right w:w="80" w:type="dxa"/>
             </w:tcMar>
           </w:tcPr>
           <w:p>
@@ -1102,7 +1102,7 @@
               <w:rPr>
                 <w:b/>
                 <w:color w:val="1E3C72"/>
-                <w:sz w:val="19"/>
+                <w:sz w:val="18"/>
               </w:rPr>
               <w:t>Exp 04</w:t>
             </w:r>
@@ -1110,12 +1110,12 @@
         </w:tc>
         <w:tc>
           <w:tcPr>
-            <w:tcW w:type="dxa" w:w="3168"/>
+            <w:tcW w:type="dxa" w:w="3312"/>
             <w:tcMar>
-              <w:top w:w="80" w:type="dxa"/>
-              <w:bottom w:w="80" w:type="dxa"/>
-              <w:left w:w="90" w:type="dxa"/>
-              <w:right w:w="90" w:type="dxa"/>
+              <w:top w:w="70" w:type="dxa"/>
+              <w:bottom w:w="70" w:type="dxa"/>
+              <w:left w:w="80" w:type="dxa"/>
+              <w:right w:w="80" w:type="dxa"/>
             </w:tcMar>
           </w:tcPr>
           <w:p>
@@ -1124,9 +1124,9 @@
             </w:pPr>
             <w:r>
               <w:rPr>
-                <w:sz w:val="19"/>
+                <w:sz w:val="18"/>
               </w:rPr>
-              <w:t>Generic DAO &amp; HTTP Servlets</w:t>
+              <w:t>Program on Implementing Generic and HTTP servlet</w:t>
             </w:r>
           </w:p>
         </w:tc>
@@ -1134,10 +1134,10 @@
           <w:tcPr>
             <w:tcW w:type="dxa" w:w="4752"/>
             <w:tcMar>
-              <w:top w:w="80" w:type="dxa"/>
-              <w:bottom w:w="80" w:type="dxa"/>
-              <w:left w:w="90" w:type="dxa"/>
-              <w:right w:w="90" w:type="dxa"/>
+              <w:top w:w="70" w:type="dxa"/>
+              <w:bottom w:w="70" w:type="dxa"/>
+              <w:left w:w="80" w:type="dxa"/>
+              <w:right w:w="80" w:type="dxa"/>
             </w:tcMar>
           </w:tcPr>
           <w:p>
@@ -1146,9 +1146,9 @@
             </w:pPr>
             <w:r>
               <w:rPr>
-                <w:sz w:val="19"/>
+                <w:sz w:val="18"/>
               </w:rPr>
-              <w:t>GenericDAO&lt;T, ID&gt; interface for type-safe persistence; Jakarta Servlets (BookTicketServlet, SearchTrainServlet, TrackPulseServlet) managing doGet/doPost.</w:t>
+              <w:t>Protocol-independent GenericRailStatusServlet extending jakarta.servlet.GenericServlet (service() method) alongside production HttpServlet controllers (LoginServlet, BookTicketServlet, TrackPulseServlet).</w:t>
             </w:r>
           </w:p>
         </w:tc>
@@ -1156,13 +1156,13 @@
       <w:tr>
         <w:tc>
           <w:tcPr>
-            <w:tcW w:type="dxa" w:w="1440"/>
+            <w:tcW w:type="dxa" w:w="1296"/>
             <w:shd w:fill="F4F6F9"/>
             <w:tcMar>
-              <w:top w:w="80" w:type="dxa"/>
-              <w:bottom w:w="80" w:type="dxa"/>
-              <w:left w:w="90" w:type="dxa"/>
-              <w:right w:w="90" w:type="dxa"/>
+              <w:top w:w="70" w:type="dxa"/>
+              <w:bottom w:w="70" w:type="dxa"/>
+              <w:left w:w="80" w:type="dxa"/>
+              <w:right w:w="80" w:type="dxa"/>
             </w:tcMar>
           </w:tcPr>
           <w:p>
@@ -1173,7 +1173,7 @@
               <w:rPr>
                 <w:b/>
                 <w:color w:val="1E3C72"/>
-                <w:sz w:val="19"/>
+                <w:sz w:val="18"/>
               </w:rPr>
               <w:t>Exp 05</w:t>
             </w:r>
@@ -1181,13 +1181,13 @@
         </w:tc>
         <w:tc>
           <w:tcPr>
-            <w:tcW w:type="dxa" w:w="3168"/>
+            <w:tcW w:type="dxa" w:w="3312"/>
             <w:shd w:fill="F4F6F9"/>
             <w:tcMar>
-              <w:top w:w="80" w:type="dxa"/>
-              <w:bottom w:w="80" w:type="dxa"/>
-              <w:left w:w="90" w:type="dxa"/>
-              <w:right w:w="90" w:type="dxa"/>
+              <w:top w:w="70" w:type="dxa"/>
+              <w:bottom w:w="70" w:type="dxa"/>
+              <w:left w:w="80" w:type="dxa"/>
+              <w:right w:w="80" w:type="dxa"/>
             </w:tcMar>
           </w:tcPr>
           <w:p>
@@ -1196,9 +1196,9 @@
             </w:pPr>
             <w:r>
               <w:rPr>
-                <w:sz w:val="19"/>
+                <w:sz w:val="18"/>
               </w:rPr>
-              <w:t>JDBC PreparedStatements &amp; MySQL</w:t>
+              <w:t>Design a login webpage in JSP that makes validation through Database using JDBC and call the servlet for various operations</w:t>
             </w:r>
           </w:p>
         </w:tc>
@@ -1207,10 +1207,10 @@
             <w:tcW w:type="dxa" w:w="4752"/>
             <w:shd w:fill="F4F6F9"/>
             <w:tcMar>
-              <w:top w:w="80" w:type="dxa"/>
-              <w:bottom w:w="80" w:type="dxa"/>
-              <w:left w:w="90" w:type="dxa"/>
-              <w:right w:w="90" w:type="dxa"/>
+              <w:top w:w="70" w:type="dxa"/>
+              <w:bottom w:w="70" w:type="dxa"/>
+              <w:left w:w="80" w:type="dxa"/>
+              <w:right w:w="80" w:type="dxa"/>
             </w:tcMar>
           </w:tcPr>
           <w:p>
@@ -1219,9 +1219,9 @@
             </w:pPr>
             <w:r>
               <w:rPr>
-                <w:sz w:val="19"/>
+                <w:sz w:val="18"/>
               </w:rPr>
-              <w:t>Singleton DBConnection pool executing parameterized queries in TrainDAO and BookingDAO to prevent SQL Injection attacks.</w:t>
+              <w:t>Secure login.jsp validating credentials via LoginServlet and DBConnection using SQL-injection resistant PreparedStatement and MySQL.</w:t>
             </w:r>
           </w:p>
         </w:tc>
@@ -1229,12 +1229,12 @@
       <w:tr>
         <w:tc>
           <w:tcPr>
-            <w:tcW w:type="dxa" w:w="1440"/>
+            <w:tcW w:type="dxa" w:w="1296"/>
             <w:tcMar>
-              <w:top w:w="80" w:type="dxa"/>
-              <w:bottom w:w="80" w:type="dxa"/>
-              <w:left w:w="90" w:type="dxa"/>
-              <w:right w:w="90" w:type="dxa"/>
+              <w:top w:w="70" w:type="dxa"/>
+              <w:bottom w:w="70" w:type="dxa"/>
+              <w:left w:w="80" w:type="dxa"/>
+              <w:right w:w="80" w:type="dxa"/>
             </w:tcMar>
           </w:tcPr>
           <w:p>
@@ -1245,7 +1245,7 @@
               <w:rPr>
                 <w:b/>
                 <w:color w:val="1E3C72"/>
-                <w:sz w:val="19"/>
+                <w:sz w:val="18"/>
               </w:rPr>
               <w:t>Exp 06</w:t>
             </w:r>
@@ -1253,12 +1253,12 @@
         </w:tc>
         <w:tc>
           <w:tcPr>
-            <w:tcW w:type="dxa" w:w="3168"/>
+            <w:tcW w:type="dxa" w:w="3312"/>
             <w:tcMar>
-              <w:top w:w="80" w:type="dxa"/>
-              <w:bottom w:w="80" w:type="dxa"/>
-              <w:left w:w="90" w:type="dxa"/>
-              <w:right w:w="90" w:type="dxa"/>
+              <w:top w:w="70" w:type="dxa"/>
+              <w:bottom w:w="70" w:type="dxa"/>
+              <w:left w:w="80" w:type="dxa"/>
+              <w:right w:w="80" w:type="dxa"/>
             </w:tcMar>
           </w:tcPr>
           <w:p>
@@ -1267,9 +1267,9 @@
             </w:pPr>
             <w:r>
               <w:rPr>
-                <w:sz w:val="19"/>
+                <w:sz w:val="18"/>
               </w:rPr>
-              <w:t>JSP Implicit Objects &amp; Action Tags</w:t>
+              <w:t>Program on Implicit and Explicit objects in JSP</w:t>
             </w:r>
           </w:p>
         </w:tc>
@@ -1277,10 +1277,10 @@
           <w:tcPr>
             <w:tcW w:type="dxa" w:w="4752"/>
             <w:tcMar>
-              <w:top w:w="80" w:type="dxa"/>
-              <w:bottom w:w="80" w:type="dxa"/>
-              <w:left w:w="90" w:type="dxa"/>
-              <w:right w:w="90" w:type="dxa"/>
+              <w:top w:w="70" w:type="dxa"/>
+              <w:bottom w:w="70" w:type="dxa"/>
+              <w:left w:w="80" w:type="dxa"/>
+              <w:right w:w="80" w:type="dxa"/>
             </w:tcMar>
           </w:tcPr>
           <w:p>
@@ -1289,9 +1289,9 @@
             </w:pPr>
             <w:r>
               <w:rPr>
-                <w:sz w:val="19"/>
+                <w:sz w:val="18"/>
               </w:rPr>
-              <w:t>Session authentication with 'session', dynamic output with 'out', and standard action tags &lt;jsp:useBean&gt; and &lt;jsp:getProperty&gt; in dashboard.jsp and ticket_confirmation.jsp.</w:t>
+              <w:t>Session state with implicit objects (session, request, out, application) in dashboard.jsp; explicit JavaBean standard actions &lt;jsp:useBean&gt; and &lt;jsp:getProperty&gt; in ticket_confirmation.jsp.</w:t>
             </w:r>
           </w:p>
         </w:tc>
@@ -1299,13 +1299,13 @@
       <w:tr>
         <w:tc>
           <w:tcPr>
-            <w:tcW w:type="dxa" w:w="1440"/>
+            <w:tcW w:type="dxa" w:w="1296"/>
             <w:shd w:fill="F4F6F9"/>
             <w:tcMar>
-              <w:top w:w="80" w:type="dxa"/>
-              <w:bottom w:w="80" w:type="dxa"/>
-              <w:left w:w="90" w:type="dxa"/>
-              <w:right w:w="90" w:type="dxa"/>
+              <w:top w:w="70" w:type="dxa"/>
+              <w:bottom w:w="70" w:type="dxa"/>
+              <w:left w:w="80" w:type="dxa"/>
+              <w:right w:w="80" w:type="dxa"/>
             </w:tcMar>
           </w:tcPr>
           <w:p>
@@ -1316,7 +1316,7 @@
               <w:rPr>
                 <w:b/>
                 <w:color w:val="1E3C72"/>
-                <w:sz w:val="19"/>
+                <w:sz w:val="18"/>
               </w:rPr>
               <w:t>Exp 07</w:t>
             </w:r>
@@ -1324,13 +1324,13 @@
         </w:tc>
         <w:tc>
           <w:tcPr>
-            <w:tcW w:type="dxa" w:w="3168"/>
+            <w:tcW w:type="dxa" w:w="3312"/>
             <w:shd w:fill="F4F6F9"/>
             <w:tcMar>
-              <w:top w:w="80" w:type="dxa"/>
-              <w:bottom w:w="80" w:type="dxa"/>
-              <w:left w:w="90" w:type="dxa"/>
-              <w:right w:w="90" w:type="dxa"/>
+              <w:top w:w="70" w:type="dxa"/>
+              <w:bottom w:w="70" w:type="dxa"/>
+              <w:left w:w="80" w:type="dxa"/>
+              <w:right w:w="80" w:type="dxa"/>
             </w:tcMar>
           </w:tcPr>
           <w:p>
@@ -1339,9 +1339,9 @@
             </w:pPr>
             <w:r>
               <w:rPr>
-                <w:sz w:val="19"/>
+                <w:sz w:val="18"/>
               </w:rPr>
-              <w:t>Client-Side JavaScript Validation</w:t>
+              <w:t>Program to create a website using HTML CSS and JavaScript</w:t>
             </w:r>
           </w:p>
         </w:tc>
@@ -1350,10 +1350,10 @@
             <w:tcW w:type="dxa" w:w="4752"/>
             <w:shd w:fill="F4F6F9"/>
             <w:tcMar>
-              <w:top w:w="80" w:type="dxa"/>
-              <w:bottom w:w="80" w:type="dxa"/>
-              <w:left w:w="90" w:type="dxa"/>
-              <w:right w:w="90" w:type="dxa"/>
+              <w:top w:w="70" w:type="dxa"/>
+              <w:bottom w:w="70" w:type="dxa"/>
+              <w:left w:w="80" w:type="dxa"/>
+              <w:right w:w="80" w:type="dxa"/>
             </w:tcMar>
           </w:tcPr>
           <w:p>
@@ -1362,9 +1362,438 @@
             </w:pPr>
             <w:r>
               <w:rPr>
-                <w:sz w:val="19"/>
+                <w:sz w:val="18"/>
               </w:rPr>
-              <w:t>DOM event handlers in validation.js validating email regex, station matching, age bounds (1–120), and 10-digit PNR integrity.</w:t>
+              <w:t>Responsive transit web portal (index.jsp, css/style.css, js/validation.js) with responsive grid layouts, card designs, and form controls.</w:t>
+            </w:r>
+          </w:p>
+        </w:tc>
+      </w:tr>
+      <w:tr>
+        <w:tc>
+          <w:tcPr>
+            <w:tcW w:type="dxa" w:w="1296"/>
+            <w:tcMar>
+              <w:top w:w="70" w:type="dxa"/>
+              <w:bottom w:w="70" w:type="dxa"/>
+              <w:left w:w="80" w:type="dxa"/>
+              <w:right w:w="80" w:type="dxa"/>
+            </w:tcMar>
+          </w:tcPr>
+          <w:p>
+            <w:pPr>
+              <w:spacing w:before="40" w:after="40"/>
+            </w:pPr>
+            <w:r>
+              <w:rPr>
+                <w:b/>
+                <w:color w:val="1E3C72"/>
+                <w:sz w:val="18"/>
+              </w:rPr>
+              <w:t>Exp 08</w:t>
+            </w:r>
+          </w:p>
+        </w:tc>
+        <w:tc>
+          <w:tcPr>
+            <w:tcW w:type="dxa" w:w="3312"/>
+            <w:tcMar>
+              <w:top w:w="70" w:type="dxa"/>
+              <w:bottom w:w="70" w:type="dxa"/>
+              <w:left w:w="80" w:type="dxa"/>
+              <w:right w:w="80" w:type="dxa"/>
+            </w:tcMar>
+          </w:tcPr>
+          <w:p>
+            <w:pPr>
+              <w:spacing w:before="40" w:after="40"/>
+            </w:pPr>
+            <w:r>
+              <w:rPr>
+                <w:sz w:val="18"/>
+              </w:rPr>
+              <w:t>Program using Java Script to validate email address ('@' &amp; '.' check with alert dialog)</w:t>
+            </w:r>
+          </w:p>
+        </w:tc>
+        <w:tc>
+          <w:tcPr>
+            <w:tcW w:type="dxa" w:w="4752"/>
+            <w:tcMar>
+              <w:top w:w="70" w:type="dxa"/>
+              <w:bottom w:w="70" w:type="dxa"/>
+              <w:left w:w="80" w:type="dxa"/>
+              <w:right w:w="80" w:type="dxa"/>
+            </w:tcMar>
+          </w:tcPr>
+          <w:p>
+            <w:pPr>
+              <w:spacing w:before="40" w:after="40"/>
+            </w:pPr>
+            <w:r>
+              <w:rPr>
+                <w:sz w:val="18"/>
+              </w:rPr>
+              <w:t>Dedicated script exp08_email_validation.js and validation.js verifying presence of '@' and '.' characters. Triggers alert dialog on missing characters and refocuses field for re-entry.</w:t>
+            </w:r>
+          </w:p>
+        </w:tc>
+      </w:tr>
+      <w:tr>
+        <w:tc>
+          <w:tcPr>
+            <w:tcW w:type="dxa" w:w="1296"/>
+            <w:shd w:fill="F4F6F9"/>
+            <w:tcMar>
+              <w:top w:w="70" w:type="dxa"/>
+              <w:bottom w:w="70" w:type="dxa"/>
+              <w:left w:w="80" w:type="dxa"/>
+              <w:right w:w="80" w:type="dxa"/>
+            </w:tcMar>
+          </w:tcPr>
+          <w:p>
+            <w:pPr>
+              <w:spacing w:before="40" w:after="40"/>
+            </w:pPr>
+            <w:r>
+              <w:rPr>
+                <w:b/>
+                <w:color w:val="1E3C72"/>
+                <w:sz w:val="18"/>
+              </w:rPr>
+              <w:t>Exp 09</w:t>
+            </w:r>
+          </w:p>
+        </w:tc>
+        <w:tc>
+          <w:tcPr>
+            <w:tcW w:type="dxa" w:w="3312"/>
+            <w:shd w:fill="F4F6F9"/>
+            <w:tcMar>
+              <w:top w:w="70" w:type="dxa"/>
+              <w:bottom w:w="70" w:type="dxa"/>
+              <w:left w:w="80" w:type="dxa"/>
+              <w:right w:w="80" w:type="dxa"/>
+            </w:tcMar>
+          </w:tcPr>
+          <w:p>
+            <w:pPr>
+              <w:spacing w:before="40" w:after="40"/>
+            </w:pPr>
+            <w:r>
+              <w:rPr>
+                <w:sz w:val="18"/>
+              </w:rPr>
+              <w:t>Program based on Document Object Model to change background color automatically every 5 seconds</w:t>
+            </w:r>
+          </w:p>
+        </w:tc>
+        <w:tc>
+          <w:tcPr>
+            <w:tcW w:type="dxa" w:w="4752"/>
+            <w:shd w:fill="F4F6F9"/>
+            <w:tcMar>
+              <w:top w:w="70" w:type="dxa"/>
+              <w:bottom w:w="70" w:type="dxa"/>
+              <w:left w:w="80" w:type="dxa"/>
+              <w:right w:w="80" w:type="dxa"/>
+            </w:tcMar>
+          </w:tcPr>
+          <w:p>
+            <w:pPr>
+              <w:spacing w:before="40" w:after="40"/>
+            </w:pPr>
+            <w:r>
+              <w:rPr>
+                <w:sz w:val="18"/>
+              </w:rPr>
+              <w:t>DOM manipulation script exp09_dom_color.js dynamically cycling transit background palettes every 5000ms using setInterval() with countdown timer and manual pause/resume.</w:t>
+            </w:r>
+          </w:p>
+        </w:tc>
+      </w:tr>
+      <w:tr>
+        <w:tc>
+          <w:tcPr>
+            <w:tcW w:type="dxa" w:w="1296"/>
+            <w:tcMar>
+              <w:top w:w="70" w:type="dxa"/>
+              <w:bottom w:w="70" w:type="dxa"/>
+              <w:left w:w="80" w:type="dxa"/>
+              <w:right w:w="80" w:type="dxa"/>
+            </w:tcMar>
+          </w:tcPr>
+          <w:p>
+            <w:pPr>
+              <w:spacing w:before="40" w:after="40"/>
+            </w:pPr>
+            <w:r>
+              <w:rPr>
+                <w:b/>
+                <w:color w:val="1E3C72"/>
+                <w:sz w:val="18"/>
+              </w:rPr>
+              <w:t>Exp 10</w:t>
+            </w:r>
+          </w:p>
+        </w:tc>
+        <w:tc>
+          <w:tcPr>
+            <w:tcW w:type="dxa" w:w="3312"/>
+            <w:tcMar>
+              <w:top w:w="70" w:type="dxa"/>
+              <w:bottom w:w="70" w:type="dxa"/>
+              <w:left w:w="80" w:type="dxa"/>
+              <w:right w:w="80" w:type="dxa"/>
+            </w:tcMar>
+          </w:tcPr>
+          <w:p>
+            <w:pPr>
+              <w:spacing w:before="40" w:after="40"/>
+            </w:pPr>
+            <w:r>
+              <w:rPr>
+                <w:sz w:val="18"/>
+              </w:rPr>
+              <w:t>Program for making use of React Hooks displaying four buttons ('Red', 'Blue', 'Green', 'Yellow')</w:t>
+            </w:r>
+          </w:p>
+        </w:tc>
+        <w:tc>
+          <w:tcPr>
+            <w:tcW w:type="dxa" w:w="4752"/>
+            <w:tcMar>
+              <w:top w:w="70" w:type="dxa"/>
+              <w:bottom w:w="70" w:type="dxa"/>
+              <w:left w:w="80" w:type="dxa"/>
+              <w:right w:w="80" w:type="dxa"/>
+            </w:tcMar>
+          </w:tcPr>
+          <w:p>
+            <w:pPr>
+              <w:spacing w:before="40" w:after="40"/>
+            </w:pPr>
+            <w:r>
+              <w:rPr>
+                <w:sz w:val="18"/>
+              </w:rPr>
+              <w:t>Interactive React functional component exp10_react_color_hooks.js using useState Hook to display Red, Blue, Green, and Yellow signal buttons and rendering: 'You have selected that particular color: [Color]'.</w:t>
+            </w:r>
+          </w:p>
+        </w:tc>
+      </w:tr>
+      <w:tr>
+        <w:tc>
+          <w:tcPr>
+            <w:tcW w:type="dxa" w:w="1296"/>
+            <w:shd w:fill="F4F6F9"/>
+            <w:tcMar>
+              <w:top w:w="70" w:type="dxa"/>
+              <w:bottom w:w="70" w:type="dxa"/>
+              <w:left w:w="80" w:type="dxa"/>
+              <w:right w:w="80" w:type="dxa"/>
+            </w:tcMar>
+          </w:tcPr>
+          <w:p>
+            <w:pPr>
+              <w:spacing w:before="40" w:after="40"/>
+            </w:pPr>
+            <w:r>
+              <w:rPr>
+                <w:b/>
+                <w:color w:val="1E3C72"/>
+                <w:sz w:val="18"/>
+              </w:rPr>
+              <w:t>Exp 11</w:t>
+            </w:r>
+          </w:p>
+        </w:tc>
+        <w:tc>
+          <w:tcPr>
+            <w:tcW w:type="dxa" w:w="3312"/>
+            <w:shd w:fill="F4F6F9"/>
+            <w:tcMar>
+              <w:top w:w="70" w:type="dxa"/>
+              <w:bottom w:w="70" w:type="dxa"/>
+              <w:left w:w="80" w:type="dxa"/>
+              <w:right w:w="80" w:type="dxa"/>
+            </w:tcMar>
+          </w:tcPr>
+          <w:p>
+            <w:pPr>
+              <w:spacing w:before="40" w:after="40"/>
+            </w:pPr>
+            <w:r>
+              <w:rPr>
+                <w:sz w:val="18"/>
+              </w:rPr>
+              <w:t>Creating a Single Page website using concepts in React (Hooks, Router, Props and States)</w:t>
+            </w:r>
+          </w:p>
+        </w:tc>
+        <w:tc>
+          <w:tcPr>
+            <w:tcW w:type="dxa" w:w="4752"/>
+            <w:shd w:fill="F4F6F9"/>
+            <w:tcMar>
+              <w:top w:w="70" w:type="dxa"/>
+              <w:bottom w:w="70" w:type="dxa"/>
+              <w:left w:w="80" w:type="dxa"/>
+              <w:right w:w="80" w:type="dxa"/>
+            </w:tcMar>
+          </w:tcPr>
+          <w:p>
+            <w:pPr>
+              <w:spacing w:before="40" w:after="40"/>
+            </w:pPr>
+            <w:r>
+              <w:rPr>
+                <w:sz w:val="18"/>
+              </w:rPr>
+              <w:t>Complete React Single Page Application (spa.jsp, exp11_react_spa.js) featuring client-side router navigation, train cards passing props, search filters, and live booking state.</w:t>
+            </w:r>
+          </w:p>
+        </w:tc>
+      </w:tr>
+      <w:tr>
+        <w:tc>
+          <w:tcPr>
+            <w:tcW w:type="dxa" w:w="1296"/>
+            <w:tcMar>
+              <w:top w:w="70" w:type="dxa"/>
+              <w:bottom w:w="70" w:type="dxa"/>
+              <w:left w:w="80" w:type="dxa"/>
+              <w:right w:w="80" w:type="dxa"/>
+            </w:tcMar>
+          </w:tcPr>
+          <w:p>
+            <w:pPr>
+              <w:spacing w:before="40" w:after="40"/>
+            </w:pPr>
+            <w:r>
+              <w:rPr>
+                <w:b/>
+                <w:color w:val="1E3C72"/>
+                <w:sz w:val="18"/>
+              </w:rPr>
+              <w:t>Exp 12</w:t>
+            </w:r>
+          </w:p>
+        </w:tc>
+        <w:tc>
+          <w:tcPr>
+            <w:tcW w:type="dxa" w:w="3312"/>
+            <w:tcMar>
+              <w:top w:w="70" w:type="dxa"/>
+              <w:bottom w:w="70" w:type="dxa"/>
+              <w:left w:w="80" w:type="dxa"/>
+              <w:right w:w="80" w:type="dxa"/>
+            </w:tcMar>
+          </w:tcPr>
+          <w:p>
+            <w:pPr>
+              <w:spacing w:before="40" w:after="40"/>
+            </w:pPr>
+            <w:r>
+              <w:rPr>
+                <w:sz w:val="18"/>
+              </w:rPr>
+              <w:t>Program to create a Monolithic Application using SpringBoot</w:t>
+            </w:r>
+          </w:p>
+        </w:tc>
+        <w:tc>
+          <w:tcPr>
+            <w:tcW w:type="dxa" w:w="4752"/>
+            <w:tcMar>
+              <w:top w:w="70" w:type="dxa"/>
+              <w:bottom w:w="70" w:type="dxa"/>
+              <w:left w:w="80" w:type="dxa"/>
+              <w:right w:w="80" w:type="dxa"/>
+            </w:tcMar>
+          </w:tcPr>
+          <w:p>
+            <w:pPr>
+              <w:spacing w:before="40" w:after="40"/>
+            </w:pPr>
+            <w:r>
+              <w:rPr>
+                <w:sz w:val="18"/>
+              </w:rPr>
+              <w:t>Spring Boot Monolithic Architecture (RailRushSpringBootApplication, RailRushMonolithController) combining Server-Side Rendering (SSR), service beans, and application context.</w:t>
+            </w:r>
+          </w:p>
+        </w:tc>
+      </w:tr>
+      <w:tr>
+        <w:tc>
+          <w:tcPr>
+            <w:tcW w:type="dxa" w:w="1296"/>
+            <w:shd w:fill="F4F6F9"/>
+            <w:tcMar>
+              <w:top w:w="70" w:type="dxa"/>
+              <w:bottom w:w="70" w:type="dxa"/>
+              <w:left w:w="80" w:type="dxa"/>
+              <w:right w:w="80" w:type="dxa"/>
+            </w:tcMar>
+          </w:tcPr>
+          <w:p>
+            <w:pPr>
+              <w:spacing w:before="40" w:after="40"/>
+            </w:pPr>
+            <w:r>
+              <w:rPr>
+                <w:b/>
+                <w:color w:val="1E3C72"/>
+                <w:sz w:val="18"/>
+              </w:rPr>
+              <w:t>Exp 13</w:t>
+            </w:r>
+          </w:p>
+        </w:tc>
+        <w:tc>
+          <w:tcPr>
+            <w:tcW w:type="dxa" w:w="3312"/>
+            <w:shd w:fill="F4F6F9"/>
+            <w:tcMar>
+              <w:top w:w="70" w:type="dxa"/>
+              <w:bottom w:w="70" w:type="dxa"/>
+              <w:left w:w="80" w:type="dxa"/>
+              <w:right w:w="80" w:type="dxa"/>
+            </w:tcMar>
+          </w:tcPr>
+          <w:p>
+            <w:pPr>
+              <w:spacing w:before="40" w:after="40"/>
+            </w:pPr>
+            <w:r>
+              <w:rPr>
+                <w:sz w:val="18"/>
+              </w:rPr>
+              <w:t>Program for Building RESTful APIs with spring boot</w:t>
+            </w:r>
+          </w:p>
+        </w:tc>
+        <w:tc>
+          <w:tcPr>
+            <w:tcW w:type="dxa" w:w="4752"/>
+            <w:shd w:fill="F4F6F9"/>
+            <w:tcMar>
+              <w:top w:w="70" w:type="dxa"/>
+              <w:bottom w:w="70" w:type="dxa"/>
+              <w:left w:w="80" w:type="dxa"/>
+              <w:right w:w="80" w:type="dxa"/>
+            </w:tcMar>
+          </w:tcPr>
+          <w:p>
+            <w:pPr>
+              <w:spacing w:before="40" w:after="40"/>
+            </w:pPr>
+            <w:r>
+              <w:rPr>
+                <w:sz w:val="18"/>
+              </w:rPr>
+              <w:t>Production headless REST API controller RailRushRestController exposing /api/v1/trains, /api/v1/bookings, /api/v1/pnr/{id}, and /api/v1/telemetry/{id} with JSON serialization.</w:t>
             </w:r>
           </w:p>
         </w:tc>
@@ -2046,13 +2475,13 @@
           <w:b/>
           <w:color w:val="1E3C72"/>
         </w:rPr>
-        <w:t xml:space="preserve">User.java &amp; PassengerUser.java: </w:t>
+        <w:t xml:space="preserve">User.java, PassengerUser.java &amp; AdminUser.java: </w:t>
       </w:r>
       <w:r>
         <w:rPr>
           <w:color w:val="2C3E50"/>
         </w:rPr>
-        <w:t>Implements core user credentials and hierarchical inheritance, storing loyalty points and preferred travel class.</w:t>
+        <w:t>Implements core user credentials and hierarchical inheritance, storing loyalty points, preferred travel class, and administrative privileges.</w:t>
       </w:r>
     </w:p>
     <w:p>
@@ -2124,7 +2553,26 @@
           <w:color w:val="FF6F00"/>
           <w:sz w:val="26"/>
         </w:rPr>
-        <w:t>5.2 Controller / Servlet Layer</w:t>
+        <w:t>5.2 Controller / Servlet Layer (Jakarta EE &amp; GenericServlet)</w:t>
+      </w:r>
+    </w:p>
+    <w:p>
+      <w:pPr>
+        <w:pStyle w:val="ListBullet"/>
+        <w:spacing w:after="60" w:line="276" w:lineRule="auto"/>
+      </w:pPr>
+      <w:r>
+        <w:rPr>
+          <w:b/>
+          <w:color w:val="1E3C72"/>
+        </w:rPr>
+        <w:t xml:space="preserve">GenericRailStatusServlet.java: </w:t>
+      </w:r>
+      <w:r>
+        <w:rPr>
+          <w:color w:val="2C3E50"/>
+        </w:rPr>
+        <w:t>Directly inherits from jakarta.servlet.GenericServlet and overrides service(ServletRequest, ServletResponse) to implement protocol-independent gateway operations (Exp 04).</w:t>
       </w:r>
     </w:p>
     <w:p>
@@ -2215,7 +2663,7 @@
           <w:color w:val="FF6F00"/>
           <w:sz w:val="26"/>
         </w:rPr>
-        <w:t>5.3 Presentation &amp; View Layer</w:t>
+        <w:t>5.3 Modern Extension: Spring Boot Monolith &amp; REST APIs</w:t>
       </w:r>
     </w:p>
     <w:p>
@@ -2228,13 +2676,13 @@
           <w:b/>
           <w:color w:val="1E3C72"/>
         </w:rPr>
-        <w:t xml:space="preserve">index.jsp: </w:t>
+        <w:t xml:space="preserve">RailRushSpringBootApplication.java: </w:t>
       </w:r>
       <w:r>
         <w:rPr>
           <w:color w:val="2C3E50"/>
         </w:rPr>
-        <w:t>Modern portal landing page with origin/destination dropdowns and quick links to live telemetry.</w:t>
+        <w:t>Annotated with @SpringBootApplication, serving as the entry point for the monolithic Spring Boot service (Exp 12).</w:t>
       </w:r>
     </w:p>
     <w:p>
@@ -2247,13 +2695,13 @@
           <w:b/>
           <w:color w:val="1E3C72"/>
         </w:rPr>
-        <w:t xml:space="preserve">dashboard.jsp: </w:t>
+        <w:t xml:space="preserve">RailRushMonolithController.java: </w:t>
       </w:r>
       <w:r>
         <w:rPr>
           <w:color w:val="2C3E50"/>
         </w:rPr>
-        <w:t>Personalized passenger view utilizing JSP implicit session objects and explicit &lt;jsp:useBean&gt; and &lt;jsp:getProperty&gt; tags.</w:t>
+        <w:t>Spring MVC controller rendering server-side templates with Model binding and session synchronization.</w:t>
       </w:r>
     </w:p>
     <w:p>
@@ -2266,32 +2714,13 @@
           <w:b/>
           <w:color w:val="1E3C72"/>
         </w:rPr>
-        <w:t xml:space="preserve">ticket_confirmation.jsp: </w:t>
+        <w:t xml:space="preserve">RailRushRestController.java: </w:t>
       </w:r>
       <w:r>
         <w:rPr>
           <w:color w:val="2C3E50"/>
         </w:rPr>
-        <w:t>E-ticket summary displaying the 10-digit PNR, passenger berth allocation, and print stylesheet.</w:t>
-      </w:r>
-    </w:p>
-    <w:p>
-      <w:pPr>
-        <w:pStyle w:val="ListBullet"/>
-        <w:spacing w:after="60" w:line="276" w:lineRule="auto"/>
-      </w:pPr>
-      <w:r>
-        <w:rPr>
-          <w:b/>
-          <w:color w:val="1E3C72"/>
-        </w:rPr>
-        <w:t xml:space="preserve">track_pulse.jsp: </w:t>
-      </w:r>
-      <w:r>
-        <w:rPr>
-          <w:color w:val="2C3E50"/>
-        </w:rPr>
-        <w:t>Telemetry monitor featuring automatic 30-second meta-refresh for live station progress.</w:t>
+        <w:t>Spring @RestController exposing headless endpoints (/api/v1/trains, /api/v1/bookings, /api/v1/pnr/{id}, /api/v1/telemetry/{id}) with JSON serialization and HTTP status codes (Exp 13).</w:t>
       </w:r>
     </w:p>
     <w:p>
@@ -2306,19 +2735,155 @@
           <w:color w:val="FF6F00"/>
           <w:sz w:val="26"/>
         </w:rPr>
-        <w:t>5.4 Client-Side Validation (validation.js)</w:t>
+        <w:t>5.4 Presentation Layer &amp; React SPA Integration</w:t>
       </w:r>
     </w:p>
     <w:p>
       <w:pPr>
-        <w:spacing w:after="120" w:line="276" w:lineRule="auto"/>
+        <w:pStyle w:val="ListBullet"/>
+        <w:spacing w:after="60" w:line="276" w:lineRule="auto"/>
       </w:pPr>
       <w:r>
         <w:rPr>
+          <w:b/>
+          <w:color w:val="1E3C72"/>
+        </w:rPr>
+        <w:t xml:space="preserve">index.jsp &amp; experiments.jsp: </w:t>
+      </w:r>
+      <w:r>
+        <w:rPr>
           <w:color w:val="2C3E50"/>
-          <w:sz w:val="22"/>
         </w:rPr>
-        <w:t>Client-side verification ensures that only sanitized inputs are transmitted to the backend servlets. Functions include validateLoginForm(), validateSearchForm() (ensuring source != destination), validateBookingForm() (enforcing passenger age between 1 and 120), and validatePNRForm() (verifying exact 10 numeric digits).</w:t>
+        <w:t>Landing portal and interactive 13-experiment demonstration laboratory suite.</w:t>
+      </w:r>
+    </w:p>
+    <w:p>
+      <w:pPr>
+        <w:pStyle w:val="ListBullet"/>
+        <w:spacing w:after="60" w:line="276" w:lineRule="auto"/>
+      </w:pPr>
+      <w:r>
+        <w:rPr>
+          <w:b/>
+          <w:color w:val="1E3C72"/>
+        </w:rPr>
+        <w:t xml:space="preserve">spa.jsp &amp; exp11_react_spa.js: </w:t>
+      </w:r>
+      <w:r>
+        <w:rPr>
+          <w:color w:val="2C3E50"/>
+        </w:rPr>
+        <w:t>Complete Single Page Application (SPA) built with React Functional Components, Hooks (useState, useEffect), simulated Router, and Props passing (Exp 11).</w:t>
+      </w:r>
+    </w:p>
+    <w:p>
+      <w:pPr>
+        <w:pStyle w:val="ListBullet"/>
+        <w:spacing w:after="60" w:line="276" w:lineRule="auto"/>
+      </w:pPr>
+      <w:r>
+        <w:rPr>
+          <w:b/>
+          <w:color w:val="1E3C72"/>
+        </w:rPr>
+        <w:t xml:space="preserve">exp10_react_color_hooks.js: </w:t>
+      </w:r>
+      <w:r>
+        <w:rPr>
+          <w:color w:val="2C3E50"/>
+        </w:rPr>
+        <w:t>Interactive React Hooks component rendering Red, Blue, Green, and Yellow buttons with dynamic selection feedback (Exp 10).</w:t>
+      </w:r>
+    </w:p>
+    <w:p>
+      <w:pPr>
+        <w:pStyle w:val="ListBullet"/>
+        <w:spacing w:after="60" w:line="276" w:lineRule="auto"/>
+      </w:pPr>
+      <w:r>
+        <w:rPr>
+          <w:b/>
+          <w:color w:val="1E3C72"/>
+        </w:rPr>
+        <w:t xml:space="preserve">dashboard.jsp &amp; ticket_confirmation.jsp: </w:t>
+      </w:r>
+      <w:r>
+        <w:rPr>
+          <w:color w:val="2C3E50"/>
+        </w:rPr>
+        <w:t>JSP views utilizing implicit objects (session, request, out) and action tags (&lt;jsp:useBean&gt;).</w:t>
+      </w:r>
+    </w:p>
+    <w:p>
+      <w:pPr>
+        <w:keepNext/>
+        <w:spacing w:before="280" w:after="80"/>
+      </w:pPr>
+      <w:r>
+        <w:rPr>
+          <w:rFonts w:ascii="Arial" w:hAnsi="Arial"/>
+          <w:b/>
+          <w:color w:val="FF6F00"/>
+          <w:sz w:val="26"/>
+        </w:rPr>
+        <w:t>5.5 Client-Side Validation &amp; DOM Manipulation</w:t>
+      </w:r>
+    </w:p>
+    <w:p>
+      <w:pPr>
+        <w:pStyle w:val="ListBullet"/>
+        <w:spacing w:after="60" w:line="276" w:lineRule="auto"/>
+      </w:pPr>
+      <w:r>
+        <w:rPr>
+          <w:b/>
+          <w:color w:val="1E3C72"/>
+        </w:rPr>
+        <w:t xml:space="preserve">exp08_email_validation.js: </w:t>
+      </w:r>
+      <w:r>
+        <w:rPr>
+          <w:color w:val="2C3E50"/>
+        </w:rPr>
+        <w:t>Validates mandatory presence of '@' and '.' characters in email inputs; raises alert dialog and refocuses field on failure (Exp 08).</w:t>
+      </w:r>
+    </w:p>
+    <w:p>
+      <w:pPr>
+        <w:pStyle w:val="ListBullet"/>
+        <w:spacing w:after="60" w:line="276" w:lineRule="auto"/>
+      </w:pPr>
+      <w:r>
+        <w:rPr>
+          <w:b/>
+          <w:color w:val="1E3C72"/>
+        </w:rPr>
+        <w:t xml:space="preserve">exp09_dom_color.js: </w:t>
+      </w:r>
+      <w:r>
+        <w:rPr>
+          <w:color w:val="2C3E50"/>
+        </w:rPr>
+        <w:t>Cycles web page background color automatically every 5 seconds (5000ms) using setInterval() with real-time countdown timer (Exp 09).</w:t>
+      </w:r>
+    </w:p>
+    <w:p>
+      <w:pPr>
+        <w:pStyle w:val="ListBullet"/>
+        <w:spacing w:after="60" w:line="276" w:lineRule="auto"/>
+      </w:pPr>
+      <w:r>
+        <w:rPr>
+          <w:b/>
+          <w:color w:val="1E3C72"/>
+        </w:rPr>
+        <w:t xml:space="preserve">validation.js: </w:t>
+      </w:r>
+      <w:r>
+        <w:rPr>
+          <w:color w:val="2C3E50"/>
+        </w:rPr>
+        <w:t>Comprehensive form validation verifying station mismatch, age range constraints (1–120), and 10-digit PNR numeric format.</w:t>
       </w:r>
     </w:p>
     <w:p>

</xml_diff>